<commit_message>
fix(templates/spec): cantSplit таблиц + keepWithNext-цепь п.15 (Промт C-prep)
</commit_message>
<xml_diff>
--- a/templates/contracts/spec_foundation_install.docx
+++ b/templates/contracts/spec_foundation_install.docx
@@ -949,6 +949,7 @@
       <w:tr>
         <w:trPr>
           <w:trHeight w:val="591"/>
+          <w:cantSplit w:val="1"/>
         </w:trPr>
         <w:tc>
           <w:tcPr>
@@ -1046,6 +1047,7 @@
       <w:tr>
         <w:trPr>
           <w:trHeight w:val="336"/>
+          <w:cantSplit w:val="1"/>
         </w:trPr>
         <w:tc>
           <w:tcPr>
@@ -1129,6 +1131,9 @@
         </w:tc>
       </w:tr>
       <w:tr>
+        <w:trPr>
+          <w:cantSplit w:val="1"/>
+        </w:trPr>
         <w:tc>
           <w:tcPr>
             <w:tcW w:w="647" w:type="dxa"/>
@@ -1187,6 +1192,9 @@
         </w:tc>
       </w:tr>
       <w:tr>
+        <w:trPr>
+          <w:cantSplit w:val="1"/>
+        </w:trPr>
         <w:tc>
           <w:tcPr>
             <w:tcW w:w="647" w:type="dxa"/>
@@ -1245,6 +1253,9 @@
         </w:tc>
       </w:tr>
       <w:tr>
+        <w:trPr>
+          <w:cantSplit w:val="1"/>
+        </w:trPr>
         <w:tc>
           <w:tcPr>
             <w:tcW w:w="647" w:type="dxa"/>
@@ -1331,6 +1342,9 @@
         </w:tc>
       </w:tr>
       <w:tr>
+        <w:trPr>
+          <w:cantSplit w:val="1"/>
+        </w:trPr>
         <w:tc>
           <w:tcPr>
             <w:tcW w:w="647" w:type="dxa"/>
@@ -1390,6 +1404,9 @@
         </w:tc>
       </w:tr>
       <w:tr>
+        <w:trPr>
+          <w:cantSplit w:val="1"/>
+        </w:trPr>
         <w:tc>
           <w:tcPr>
             <w:tcW w:w="647" w:type="dxa"/>
@@ -1447,6 +1464,9 @@
         </w:tc>
       </w:tr>
       <w:tr>
+        <w:trPr>
+          <w:cantSplit w:val="1"/>
+        </w:trPr>
         <w:tc>
           <w:tcPr>
             <w:tcW w:w="647" w:type="dxa"/>
@@ -1510,6 +1530,9 @@
         </w:tc>
       </w:tr>
       <w:tr>
+        <w:trPr>
+          <w:cantSplit w:val="1"/>
+        </w:trPr>
         <w:tc>
           <w:tcPr>
             <w:tcW w:w="647" w:type="dxa"/>
@@ -1570,6 +1593,9 @@
         </w:tc>
       </w:tr>
       <w:tr>
+        <w:trPr>
+          <w:cantSplit w:val="1"/>
+        </w:trPr>
         <w:tc>
           <w:tcPr>
             <w:tcW w:w="647" w:type="dxa"/>
@@ -1631,6 +1657,7 @@
       <w:tr>
         <w:trPr>
           <w:trHeight w:val="936"/>
+          <w:cantSplit w:val="1"/>
         </w:trPr>
         <w:tc>
           <w:tcPr>
@@ -1727,6 +1754,7 @@
         <w:rPr>
           <w:b/>
         </w:rPr>
+        <w:keepWithNext w:val="1"/>
       </w:pPr>
     </w:p>
     <w:tbl>
@@ -1753,6 +1781,7 @@
       <w:tr>
         <w:trPr>
           <w:tblHeader/>
+          <w:cantSplit w:val="1"/>
         </w:trPr>
         <w:tc>
           <w:tcPr>
@@ -1770,6 +1799,7 @@
           <w:p>
             <w:pPr>
               <w:jc w:val="center"/>
+              <w:keepWithNext w:val="1"/>
             </w:pPr>
             <w:r>
               <w:rPr>
@@ -1796,6 +1826,7 @@
           <w:p>
             <w:pPr>
               <w:jc w:val="center"/>
+              <w:keepWithNext w:val="1"/>
             </w:pPr>
             <w:r>
               <w:rPr>
@@ -1807,6 +1838,9 @@
         </w:tc>
       </w:tr>
       <w:tr>
+        <w:trPr>
+          <w:cantSplit w:val="1"/>
+        </w:trPr>
         <w:tc>
           <w:tcPr>
             <w:tcW w:w="7626" w:type="dxa"/>
@@ -1822,6 +1856,7 @@
           <w:p>
             <w:pPr>
               <w:jc w:val="center"/>
+              <w:keepWithNext w:val="1"/>
             </w:pPr>
             <w:r>
               <w:t>Модульная грузоприемная платформа сплошного типа, шт.</w:t>
@@ -1844,6 +1879,7 @@
           <w:p>
             <w:pPr>
               <w:jc w:val="center"/>
+              <w:keepWithNext w:val="1"/>
             </w:pPr>
             <w:r>
               <w:t>1</w:t>
@@ -1852,6 +1888,9 @@
         </w:tc>
       </w:tr>
       <w:tr>
+        <w:trPr>
+          <w:cantSplit w:val="1"/>
+        </w:trPr>
         <w:tc>
           <w:tcPr>
             <w:tcW w:w="7626" w:type="dxa"/>
@@ -1867,6 +1906,7 @@
           <w:p>
             <w:pPr>
               <w:jc w:val="center"/>
+              <w:keepWithNext w:val="1"/>
             </w:pPr>
             <w:r>
               <w:t xml:space="preserve">Датчик весоизмерительный цифровой </w:t>
@@ -1898,6 +1938,7 @@
           <w:p>
             <w:pPr>
               <w:jc w:val="center"/>
+              <w:keepWithNext w:val="1"/>
             </w:pPr>
             <w:r>
               <w:t>8</w:t>
@@ -1906,6 +1947,9 @@
         </w:tc>
       </w:tr>
       <w:tr>
+        <w:trPr>
+          <w:cantSplit w:val="1"/>
+        </w:trPr>
         <w:tc>
           <w:tcPr>
             <w:tcW w:w="7626" w:type="dxa"/>
@@ -1921,6 +1965,7 @@
           <w:p>
             <w:pPr>
               <w:jc w:val="center"/>
+              <w:keepWithNext w:val="1"/>
             </w:pPr>
             <w:r>
               <w:t>Терминал весовой цифровой ТИТАН 3ЦС, шт.</w:t>
@@ -1943,6 +1988,7 @@
           <w:p>
             <w:pPr>
               <w:jc w:val="center"/>
+              <w:keepWithNext w:val="1"/>
             </w:pPr>
             <w:r>
               <w:t>1</w:t>
@@ -1951,6 +1997,9 @@
         </w:tc>
       </w:tr>
       <w:tr>
+        <w:trPr>
+          <w:cantSplit w:val="1"/>
+        </w:trPr>
         <w:tc>
           <w:tcPr>
             <w:tcW w:w="7626" w:type="dxa"/>
@@ -1966,6 +2015,7 @@
           <w:p>
             <w:pPr>
               <w:jc w:val="center"/>
+              <w:keepWithNext w:val="1"/>
             </w:pPr>
             <w:r>
               <w:t>Коробка соединительная КБТ-8-Ц, шт.</w:t>
@@ -1988,6 +2038,7 @@
           <w:p>
             <w:pPr>
               <w:jc w:val="center"/>
+              <w:keepWithNext w:val="1"/>
             </w:pPr>
             <w:r>
               <w:t>1</w:t>
@@ -1996,6 +2047,9 @@
         </w:tc>
       </w:tr>
       <w:tr>
+        <w:trPr>
+          <w:cantSplit w:val="1"/>
+        </w:trPr>
         <w:tc>
           <w:tcPr>
             <w:tcW w:w="7626" w:type="dxa"/>
@@ -2011,6 +2065,7 @@
           <w:p>
             <w:pPr>
               <w:jc w:val="center"/>
+              <w:keepWithNext w:val="1"/>
             </w:pPr>
             <w:r>
               <w:t xml:space="preserve">Металлорукав в ПВХ-изоляции, компл.  </w:t>
@@ -2033,6 +2088,7 @@
           <w:p>
             <w:pPr>
               <w:jc w:val="center"/>
+              <w:keepWithNext w:val="1"/>
             </w:pPr>
             <w:r>
               <w:t>1</w:t>
@@ -2041,6 +2097,9 @@
         </w:tc>
       </w:tr>
       <w:tr>
+        <w:trPr>
+          <w:cantSplit w:val="1"/>
+        </w:trPr>
         <w:tc>
           <w:tcPr>
             <w:tcW w:w="7626" w:type="dxa"/>
@@ -2056,6 +2115,7 @@
           <w:p>
             <w:pPr>
               <w:jc w:val="center"/>
+              <w:keepWithNext w:val="1"/>
             </w:pPr>
             <w:r>
               <w:t>Кабель сигнальный, м</w:t>
@@ -2078,6 +2138,7 @@
           <w:p>
             <w:pPr>
               <w:jc w:val="center"/>
+              <w:keepWithNext w:val="1"/>
             </w:pPr>
             <w:r>
               <w:t>20</w:t>
@@ -2088,6 +2149,7 @@
       <w:tr>
         <w:trPr>
           <w:trHeight w:val="432"/>
+          <w:cantSplit w:val="1"/>
         </w:trPr>
         <w:tc>
           <w:tcPr>

</xml_diff>